<commit_message>
small clean ups and removed 2019 LUC intensity because not useful
</commit_message>
<xml_diff>
--- a/output/tables/main_results.docx
+++ b/output/tables/main_results.docx
@@ -139,7 +139,7 @@
               <w:pStyle w:val="Compact"/>
             </w:pPr>
             <w:r>
-              <w:t xml:space="preserve">13.733</w:t>
+              <w:t xml:space="preserve">13.732</w:t>
             </w:r>
           </w:p>
         </w:tc>
@@ -194,7 +194,7 @@
               <w:pStyle w:val="Compact"/>
             </w:pPr>
             <w:r>
-              <w:t xml:space="preserve">14.776</w:t>
+              <w:t xml:space="preserve">14.777</w:t>
             </w:r>
           </w:p>
         </w:tc>
@@ -458,7 +458,7 @@
               <w:pStyle w:val="Compact"/>
             </w:pPr>
             <w:r>
-              <w:t xml:space="preserve">(0.002)</w:t>
+              <w:t xml:space="preserve">(0.003)</w:t>
             </w:r>
           </w:p>
         </w:tc>
@@ -1269,7 +1269,7 @@
               <w:pStyle w:val="Compact"/>
             </w:pPr>
             <w:r>
-              <w:t xml:space="preserve">-0.177</w:t>
+              <w:t xml:space="preserve">-0.176</w:t>
             </w:r>
           </w:p>
         </w:tc>
@@ -1302,7 +1302,7 @@
               <w:pStyle w:val="Compact"/>
             </w:pPr>
             <w:r>
-              <w:t xml:space="preserve">-0.135</w:t>
+              <w:t xml:space="preserve">-0.134</w:t>
             </w:r>
           </w:p>
         </w:tc>
@@ -1435,7 +1435,7 @@
               <w:pStyle w:val="Compact"/>
             </w:pPr>
             <w:r>
-              <w:t xml:space="preserve">-0.141</w:t>
+              <w:t xml:space="preserve">-0.140</w:t>
             </w:r>
           </w:p>
         </w:tc>
@@ -1457,7 +1457,7 @@
               <w:pStyle w:val="Compact"/>
             </w:pPr>
             <w:r>
-              <w:t xml:space="preserve">-0.024</w:t>
+              <w:t xml:space="preserve">-0.023</w:t>
             </w:r>
           </w:p>
         </w:tc>
@@ -1623,18 +1623,18 @@
               <w:pStyle w:val="Compact"/>
             </w:pPr>
             <w:r>
-              <w:t xml:space="preserve">-0.132</w:t>
-            </w:r>
-          </w:p>
-        </w:tc>
-        <w:tc>
-          <w:tcPr/>
-          <w:p>
-            <w:pPr>
-              <w:pStyle w:val="Compact"/>
-            </w:pPr>
-            <w:r>
-              <w:t xml:space="preserve">-0.051</w:t>
+              <w:t xml:space="preserve">-0.131</w:t>
+            </w:r>
+          </w:p>
+        </w:tc>
+        <w:tc>
+          <w:tcPr/>
+          <w:p>
+            <w:pPr>
+              <w:pStyle w:val="Compact"/>
+            </w:pPr>
+            <w:r>
+              <w:t xml:space="preserve">-0.050</w:t>
             </w:r>
           </w:p>
         </w:tc>
@@ -1789,29 +1789,29 @@
               <w:pStyle w:val="Compact"/>
             </w:pPr>
             <w:r>
-              <w:t xml:space="preserve">-0.208</w:t>
-            </w:r>
-          </w:p>
-        </w:tc>
-        <w:tc>
-          <w:tcPr/>
-          <w:p>
-            <w:pPr>
-              <w:pStyle w:val="Compact"/>
-            </w:pPr>
-            <w:r>
-              <w:t xml:space="preserve">-0.145</w:t>
-            </w:r>
-          </w:p>
-        </w:tc>
-        <w:tc>
-          <w:tcPr/>
-          <w:p>
-            <w:pPr>
-              <w:pStyle w:val="Compact"/>
-            </w:pPr>
-            <w:r>
-              <w:t xml:space="preserve">-0.092</w:t>
+              <w:t xml:space="preserve">-0.207</w:t>
+            </w:r>
+          </w:p>
+        </w:tc>
+        <w:tc>
+          <w:tcPr/>
+          <w:p>
+            <w:pPr>
+              <w:pStyle w:val="Compact"/>
+            </w:pPr>
+            <w:r>
+              <w:t xml:space="preserve">-0.144</w:t>
+            </w:r>
+          </w:p>
+        </w:tc>
+        <w:tc>
+          <w:tcPr/>
+          <w:p>
+            <w:pPr>
+              <w:pStyle w:val="Compact"/>
+            </w:pPr>
+            <w:r>
+              <w:t xml:space="preserve">-0.091</w:t>
             </w:r>
           </w:p>
         </w:tc>
@@ -1833,7 +1833,7 @@
               <w:pStyle w:val="Compact"/>
             </w:pPr>
             <w:r>
-              <w:t xml:space="preserve">-0.117</w:t>
+              <w:t xml:space="preserve">-0.116</w:t>
             </w:r>
           </w:p>
         </w:tc>
@@ -1920,7 +1920,7 @@
               <w:pStyle w:val="Compact"/>
             </w:pPr>
             <w:r>
-              <w:t xml:space="preserve">(0.045)</w:t>
+              <w:t xml:space="preserve">(0.046)</w:t>
             </w:r>
           </w:p>
         </w:tc>
@@ -2620,7 +2620,7 @@
               <w:pStyle w:val="Compact"/>
             </w:pPr>
             <w:r>
-              <w:t xml:space="preserve">0.334</w:t>
+              <w:t xml:space="preserve">0.335</w:t>
             </w:r>
           </w:p>
         </w:tc>
@@ -2789,29 +2789,29 @@
               <w:pStyle w:val="Compact"/>
             </w:pPr>
             <w:r>
-              <w:t xml:space="preserve">24394.8</w:t>
-            </w:r>
-          </w:p>
-        </w:tc>
-        <w:tc>
-          <w:tcPr/>
-          <w:p>
-            <w:pPr>
-              <w:pStyle w:val="Compact"/>
-            </w:pPr>
-            <w:r>
-              <w:t xml:space="preserve">24394.9</w:t>
-            </w:r>
-          </w:p>
-        </w:tc>
-        <w:tc>
-          <w:tcPr/>
-          <w:p>
-            <w:pPr>
-              <w:pStyle w:val="Compact"/>
-            </w:pPr>
-            <w:r>
-              <w:t xml:space="preserve">3576.8</w:t>
+              <w:t xml:space="preserve">24394.7</w:t>
+            </w:r>
+          </w:p>
+        </w:tc>
+        <w:tc>
+          <w:tcPr/>
+          <w:p>
+            <w:pPr>
+              <w:pStyle w:val="Compact"/>
+            </w:pPr>
+            <w:r>
+              <w:t xml:space="preserve">24394.6</w:t>
+            </w:r>
+          </w:p>
+        </w:tc>
+        <w:tc>
+          <w:tcPr/>
+          <w:p>
+            <w:pPr>
+              <w:pStyle w:val="Compact"/>
+            </w:pPr>
+            <w:r>
+              <w:t xml:space="preserve">3576.7</w:t>
             </w:r>
           </w:p>
         </w:tc>
@@ -2879,18 +2879,18 @@
               <w:pStyle w:val="Compact"/>
             </w:pPr>
             <w:r>
-              <w:t xml:space="preserve">24486.3</w:t>
-            </w:r>
-          </w:p>
-        </w:tc>
-        <w:tc>
-          <w:tcPr/>
-          <w:p>
-            <w:pPr>
-              <w:pStyle w:val="Compact"/>
-            </w:pPr>
-            <w:r>
-              <w:t xml:space="preserve">24516.8</w:t>
+              <w:t xml:space="preserve">24486.2</w:t>
+            </w:r>
+          </w:p>
+        </w:tc>
+        <w:tc>
+          <w:tcPr/>
+          <w:p>
+            <w:pPr>
+              <w:pStyle w:val="Compact"/>
+            </w:pPr>
+            <w:r>
+              <w:t xml:space="preserve">24516.5</w:t>
             </w:r>
           </w:p>
         </w:tc>
@@ -2912,7 +2912,7 @@
               <w:pStyle w:val="Compact"/>
             </w:pPr>
             <w:r>
-              <w:t xml:space="preserve">4069.5</w:t>
+              <w:t xml:space="preserve">4069.4</w:t>
             </w:r>
           </w:p>
         </w:tc>
@@ -2969,73 +2969,73 @@
               <w:pStyle w:val="Compact"/>
             </w:pPr>
             <w:r>
-              <w:t xml:space="preserve">-12185.422</w:t>
-            </w:r>
-          </w:p>
-        </w:tc>
-        <w:tc>
-          <w:tcPr/>
-          <w:p>
-            <w:pPr>
-              <w:pStyle w:val="Compact"/>
-            </w:pPr>
-            <w:r>
-              <w:t xml:space="preserve">-12181.459</w:t>
-            </w:r>
-          </w:p>
-        </w:tc>
-        <w:tc>
-          <w:tcPr/>
-          <w:p>
-            <w:pPr>
-              <w:pStyle w:val="Compact"/>
-            </w:pPr>
-            <w:r>
-              <w:t xml:space="preserve">-1780.380</w:t>
-            </w:r>
-          </w:p>
-        </w:tc>
-        <w:tc>
-          <w:tcPr/>
-          <w:p>
-            <w:pPr>
-              <w:pStyle w:val="Compact"/>
-            </w:pPr>
-            <w:r>
-              <w:t xml:space="preserve">-2002.921</w:t>
-            </w:r>
-          </w:p>
-        </w:tc>
-        <w:tc>
-          <w:tcPr/>
-          <w:p>
-            <w:pPr>
-              <w:pStyle w:val="Compact"/>
-            </w:pPr>
-            <w:r>
-              <w:t xml:space="preserve">-2410.092</w:t>
-            </w:r>
-          </w:p>
-        </w:tc>
-        <w:tc>
-          <w:tcPr/>
-          <w:p>
-            <w:pPr>
-              <w:pStyle w:val="Compact"/>
-            </w:pPr>
-            <w:r>
-              <w:t xml:space="preserve">-2671.072</w:t>
-            </w:r>
-          </w:p>
-        </w:tc>
-        <w:tc>
-          <w:tcPr/>
-          <w:p>
-            <w:pPr>
-              <w:pStyle w:val="Compact"/>
-            </w:pPr>
-            <w:r>
-              <w:t xml:space="preserve">-3120.184</w:t>
+              <w:t xml:space="preserve">-12185.372</w:t>
+            </w:r>
+          </w:p>
+        </w:tc>
+        <w:tc>
+          <w:tcPr/>
+          <w:p>
+            <w:pPr>
+              <w:pStyle w:val="Compact"/>
+            </w:pPr>
+            <w:r>
+              <w:t xml:space="preserve">-12181.310</w:t>
+            </w:r>
+          </w:p>
+        </w:tc>
+        <w:tc>
+          <w:tcPr/>
+          <w:p>
+            <w:pPr>
+              <w:pStyle w:val="Compact"/>
+            </w:pPr>
+            <w:r>
+              <w:t xml:space="preserve">-1780.374</w:t>
+            </w:r>
+          </w:p>
+        </w:tc>
+        <w:tc>
+          <w:tcPr/>
+          <w:p>
+            <w:pPr>
+              <w:pStyle w:val="Compact"/>
+            </w:pPr>
+            <w:r>
+              <w:t xml:space="preserve">-2002.910</w:t>
+            </w:r>
+          </w:p>
+        </w:tc>
+        <w:tc>
+          <w:tcPr/>
+          <w:p>
+            <w:pPr>
+              <w:pStyle w:val="Compact"/>
+            </w:pPr>
+            <w:r>
+              <w:t xml:space="preserve">-2410.091</w:t>
+            </w:r>
+          </w:p>
+        </w:tc>
+        <w:tc>
+          <w:tcPr/>
+          <w:p>
+            <w:pPr>
+              <w:pStyle w:val="Compact"/>
+            </w:pPr>
+            <w:r>
+              <w:t xml:space="preserve">-2671.064</w:t>
+            </w:r>
+          </w:p>
+        </w:tc>
+        <w:tc>
+          <w:tcPr/>
+          <w:p>
+            <w:pPr>
+              <w:pStyle w:val="Compact"/>
+            </w:pPr>
+            <w:r>
+              <w:t xml:space="preserve">-3120.189</w:t>
             </w:r>
           </w:p>
         </w:tc>

</xml_diff>